<commit_message>
v20b: insert 3 figures into both theses — 4-3 encounter protocol, 5-2 health traces, 5-5 ablation n=20+two-regime (stopdist->5-3, KM->5-4); KO 88pp / EN 96pp, both 2-pass mapped 77 missing []
Co-Authored-By: Claude Fable 5 <noreply@anthropic.com>
Claude-Session: https://claude.ai/code/session_01NtLkxt91PCkwwW6kGTEs5W
</commit_message>
<xml_diff>
--- a/doc/thesis_en_v20_0826.docx
+++ b/doc/thesis_en_v20_0826.docx
@@ -1526,7 +1526,7 @@
           <w:sz w:val="22"/>
         </w:rPr>
         <w:tab/>
-        <w:t>36</w:t>
+        <w:t>37</w:t>
       </w:r>
     </w:p>
     <w:p>
@@ -1552,7 +1552,7 @@
           <w:sz w:val="22"/>
         </w:rPr>
         <w:tab/>
-        <w:t>38</w:t>
+        <w:t>39</w:t>
       </w:r>
     </w:p>
     <w:p>
@@ -1604,7 +1604,7 @@
           <w:sz w:val="22"/>
         </w:rPr>
         <w:tab/>
-        <w:t>40</w:t>
+        <w:t>41</w:t>
       </w:r>
     </w:p>
     <w:p>
@@ -1630,7 +1630,7 @@
           <w:sz w:val="22"/>
         </w:rPr>
         <w:tab/>
-        <w:t>41</w:t>
+        <w:t>42</w:t>
       </w:r>
     </w:p>
     <w:p>
@@ -1656,7 +1656,7 @@
           <w:sz w:val="22"/>
         </w:rPr>
         <w:tab/>
-        <w:t>44</w:t>
+        <w:t>45</w:t>
       </w:r>
     </w:p>
     <w:p>
@@ -1682,7 +1682,7 @@
           <w:sz w:val="22"/>
         </w:rPr>
         <w:tab/>
-        <w:t>44</w:t>
+        <w:t>45</w:t>
       </w:r>
     </w:p>
     <w:p>
@@ -1708,7 +1708,7 @@
           <w:sz w:val="22"/>
         </w:rPr>
         <w:tab/>
-        <w:t>50</w:t>
+        <w:t>52</w:t>
       </w:r>
     </w:p>
     <w:p>
@@ -1734,7 +1734,7 @@
           <w:sz w:val="22"/>
         </w:rPr>
         <w:tab/>
-        <w:t>51</w:t>
+        <w:t>53</w:t>
       </w:r>
     </w:p>
     <w:p>
@@ -1760,7 +1760,7 @@
           <w:sz w:val="22"/>
         </w:rPr>
         <w:tab/>
-        <w:t>54</w:t>
+        <w:t>55</w:t>
       </w:r>
     </w:p>
     <w:p>
@@ -1786,7 +1786,7 @@
           <w:sz w:val="22"/>
         </w:rPr>
         <w:tab/>
-        <w:t>54</w:t>
+        <w:t>56</w:t>
       </w:r>
     </w:p>
     <w:p>
@@ -1812,7 +1812,7 @@
           <w:sz w:val="22"/>
         </w:rPr>
         <w:tab/>
-        <w:t>60</w:t>
+        <w:t>61</w:t>
       </w:r>
     </w:p>
     <w:p>
@@ -1838,7 +1838,7 @@
           <w:sz w:val="22"/>
         </w:rPr>
         <w:tab/>
-        <w:t>61</w:t>
+        <w:t>62</w:t>
       </w:r>
     </w:p>
     <w:p>
@@ -1864,7 +1864,7 @@
           <w:sz w:val="22"/>
         </w:rPr>
         <w:tab/>
-        <w:t>62</w:t>
+        <w:t>63</w:t>
       </w:r>
     </w:p>
     <w:p>
@@ -1890,7 +1890,7 @@
           <w:sz w:val="22"/>
         </w:rPr>
         <w:tab/>
-        <w:t>64</w:t>
+        <w:t>65</w:t>
       </w:r>
     </w:p>
     <w:p>
@@ -1916,7 +1916,7 @@
           <w:sz w:val="22"/>
         </w:rPr>
         <w:tab/>
-        <w:t>64</w:t>
+        <w:t>65</w:t>
       </w:r>
     </w:p>
     <w:p>
@@ -1942,7 +1942,7 @@
           <w:sz w:val="22"/>
         </w:rPr>
         <w:tab/>
-        <w:t>64</w:t>
+        <w:t>65</w:t>
       </w:r>
     </w:p>
     <w:p>
@@ -1968,7 +1968,7 @@
           <w:sz w:val="22"/>
         </w:rPr>
         <w:tab/>
-        <w:t>65</w:t>
+        <w:t>66</w:t>
       </w:r>
     </w:p>
     <w:p>
@@ -1994,7 +1994,7 @@
           <w:sz w:val="22"/>
         </w:rPr>
         <w:tab/>
-        <w:t>66</w:t>
+        <w:t>67</w:t>
       </w:r>
     </w:p>
     <w:p>
@@ -2020,7 +2020,7 @@
           <w:sz w:val="22"/>
         </w:rPr>
         <w:tab/>
-        <w:t>66</w:t>
+        <w:t>67</w:t>
       </w:r>
     </w:p>
     <w:p>
@@ -2046,7 +2046,7 @@
           <w:sz w:val="22"/>
         </w:rPr>
         <w:tab/>
-        <w:t>64</w:t>
+        <w:t>65</w:t>
       </w:r>
     </w:p>
     <w:p>
@@ -2072,7 +2072,7 @@
           <w:sz w:val="22"/>
         </w:rPr>
         <w:tab/>
-        <w:t>70</w:t>
+        <w:t>71</w:t>
       </w:r>
     </w:p>
     <w:p>
@@ -2098,7 +2098,7 @@
           <w:sz w:val="22"/>
         </w:rPr>
         <w:tab/>
-        <w:t>73</w:t>
+        <w:t>74</w:t>
       </w:r>
     </w:p>
     <w:p>
@@ -2124,7 +2124,7 @@
           <w:sz w:val="22"/>
         </w:rPr>
         <w:tab/>
-        <w:t>79</w:t>
+        <w:t>80</w:t>
       </w:r>
     </w:p>
     <w:p>
@@ -2248,7 +2248,7 @@
           <w:sz w:val="22"/>
         </w:rPr>
         <w:tab/>
-        <w:t>39</w:t>
+        <w:t>40</w:t>
       </w:r>
     </w:p>
     <w:p>
@@ -2274,7 +2274,7 @@
           <w:sz w:val="22"/>
         </w:rPr>
         <w:tab/>
-        <w:t>41</w:t>
+        <w:t>42</w:t>
       </w:r>
     </w:p>
     <w:p>
@@ -2300,7 +2300,7 @@
           <w:sz w:val="22"/>
         </w:rPr>
         <w:tab/>
-        <w:t>45</w:t>
+        <w:t>46</w:t>
       </w:r>
     </w:p>
     <w:p>
@@ -2326,7 +2326,7 @@
           <w:sz w:val="22"/>
         </w:rPr>
         <w:tab/>
-        <w:t>49</w:t>
+        <w:t>51</w:t>
       </w:r>
     </w:p>
     <w:p>
@@ -2352,7 +2352,7 @@
           <w:sz w:val="22"/>
         </w:rPr>
         <w:tab/>
-        <w:t>52</w:t>
+        <w:t>54</w:t>
       </w:r>
     </w:p>
     <w:p>
@@ -2378,7 +2378,7 @@
           <w:sz w:val="22"/>
         </w:rPr>
         <w:tab/>
-        <w:t>55</w:t>
+        <w:t>56</w:t>
       </w:r>
     </w:p>
     <w:p>
@@ -2404,7 +2404,7 @@
           <w:sz w:val="22"/>
         </w:rPr>
         <w:tab/>
-        <w:t>55</w:t>
+        <w:t>56</w:t>
       </w:r>
     </w:p>
     <w:p>
@@ -2430,7 +2430,7 @@
           <w:sz w:val="22"/>
         </w:rPr>
         <w:tab/>
-        <w:t>59</w:t>
+        <w:t>60</w:t>
       </w:r>
     </w:p>
     <w:p>
@@ -2456,7 +2456,7 @@
           <w:sz w:val="22"/>
         </w:rPr>
         <w:tab/>
-        <w:t>62</w:t>
+        <w:t>63</w:t>
       </w:r>
     </w:p>
     <w:p>
@@ -2482,7 +2482,7 @@
           <w:sz w:val="22"/>
         </w:rPr>
         <w:tab/>
-        <w:t>63</w:t>
+        <w:t>64</w:t>
       </w:r>
     </w:p>
     <w:p>
@@ -2701,7 +2701,7 @@
           <w:b w:val="0"/>
           <w:sz w:val="22"/>
         </w:rPr>
-        <w:t>Figure 5-1. Detection latency distributions per fault condition (proposed arm, measured from injection time)</w:t>
+        <w:t>Figure 4-3. Pedestrian dart-out injection protocol</w:t>
       </w:r>
       <w:r>
         <w:rPr>
@@ -2710,7 +2710,7 @@
           <w:sz w:val="22"/>
         </w:rPr>
         <w:tab/>
-        <w:t>47</w:t>
+        <w:t>36</w:t>
       </w:r>
     </w:p>
     <w:p>
@@ -2727,7 +2727,7 @@
           <w:b w:val="0"/>
           <w:sz w:val="22"/>
         </w:rPr>
-        <w:t>Figure 5-2. Stopping-distance model d = vτ + v²/2a (τ=1.5 s, a=3.5 m/s²) and the measured avoidance/collision boundaries from the distance ladder (shaded bands)</w:t>
+        <w:t>Figure 5-1. Detection latency distributions per fault condition (proposed arm, measured from injection time)</w:t>
       </w:r>
       <w:r>
         <w:rPr>
@@ -2736,7 +2736,7 @@
           <w:sz w:val="22"/>
         </w:rPr>
         <w:tab/>
-        <w:t>53</w:t>
+        <w:t>48</w:t>
       </w:r>
     </w:p>
     <w:p>
@@ -2753,7 +2753,7 @@
           <w:b w:val="0"/>
           <w:sz w:val="22"/>
         </w:rPr>
-        <w:t>Figure 5-3. Kaplan–Meier curve of lane clearance for no-collision evacuation cases (first-round ablation sample, conditional n=13)</w:t>
+        <w:t>Figure 5-2. Continuous health traces — band separation of the state-transition input channel (solid: perception) against the dual thresholds (0.7/0.3)</w:t>
       </w:r>
       <w:r>
         <w:rPr>
@@ -2762,7 +2762,85 @@
           <w:sz w:val="22"/>
         </w:rPr>
         <w:tab/>
-        <w:t>60</w:t>
+        <w:t>50</w:t>
+      </w:r>
+    </w:p>
+    <w:p>
+      <w:pPr>
+        <w:tabs>
+          <w:tab w:pos="8504" w:val="right" w:leader="dot"/>
+        </w:tabs>
+        <w:spacing w:line="501" w:lineRule="exact"/>
+        <w:ind w:left="0"/>
+      </w:pPr>
+      <w:r>
+        <w:rPr>
+          <w:rFonts w:ascii="Times New Roman" w:hAnsi="Times New Roman" w:eastAsia="HY신명조"/>
+          <w:b w:val="0"/>
+          <w:sz w:val="22"/>
+        </w:rPr>
+        <w:t>Figure 5-3. Stopping-distance model d = vτ + v²/2a (τ=1.5 s, a=3.5 m/s²) and the measured avoidance/collision boundaries from the distance ladder (shaded bands)</w:t>
+      </w:r>
+      <w:r>
+        <w:rPr>
+          <w:rFonts w:ascii="Times New Roman" w:hAnsi="Times New Roman" w:eastAsia="HY신명조"/>
+          <w:b w:val="0"/>
+          <w:sz w:val="22"/>
+        </w:rPr>
+        <w:tab/>
+        <w:t>54</w:t>
+      </w:r>
+    </w:p>
+    <w:p>
+      <w:pPr>
+        <w:tabs>
+          <w:tab w:pos="8504" w:val="right" w:leader="dot"/>
+        </w:tabs>
+        <w:spacing w:line="501" w:lineRule="exact"/>
+        <w:ind w:left="0"/>
+      </w:pPr>
+      <w:r>
+        <w:rPr>
+          <w:rFonts w:ascii="Times New Roman" w:hAnsi="Times New Roman" w:eastAsia="HY신명조"/>
+          <w:b w:val="0"/>
+          <w:sz w:val="22"/>
+        </w:rPr>
+        <w:t>Figure 5-4. Kaplan–Meier curve of lane clearance for no-collision evacuation cases (first-round ablation sample, conditional n=13)</w:t>
+      </w:r>
+      <w:r>
+        <w:rPr>
+          <w:rFonts w:ascii="Times New Roman" w:hAnsi="Times New Roman" w:eastAsia="HY신명조"/>
+          <w:b w:val="0"/>
+          <w:sz w:val="22"/>
+        </w:rPr>
+        <w:tab/>
+        <w:t>61</w:t>
+      </w:r>
+    </w:p>
+    <w:p>
+      <w:pPr>
+        <w:tabs>
+          <w:tab w:pos="8504" w:val="right" w:leader="dot"/>
+        </w:tabs>
+        <w:spacing w:line="501" w:lineRule="exact"/>
+        <w:ind w:left="0"/>
+      </w:pPr>
+      <w:r>
+        <w:rPr>
+          <w:rFonts w:ascii="Times New Roman" w:hAnsi="Times New Roman" w:eastAsia="HY신명조"/>
+          <w:b w:val="0"/>
+          <w:sz w:val="22"/>
+        </w:rPr>
+        <w:t>Figure 5-5. Ablation results (ledger verdicts, pooled n = 20)</w:t>
+      </w:r>
+      <w:r>
+        <w:rPr>
+          <w:rFonts w:ascii="Times New Roman" w:hAnsi="Times New Roman" w:eastAsia="HY신명조"/>
+          <w:b w:val="0"/>
+          <w:sz w:val="22"/>
+        </w:rPr>
+        <w:tab/>
+        <w:t>62</w:t>
       </w:r>
     </w:p>
     <w:p>
@@ -8327,8 +8405,68 @@
           <w:b w:val="0"/>
           <w:sz w:val="22"/>
         </w:rPr>
-        <w:t xml:space="preserve">   The v5 injector for the ablation study adds three things. First, a behavior-independent time trigger: a shadow detector subscribing to the monitoring module's scores takes as t_detect the moment the same threshold as the supervisor is crossed, and in all arms launches a pedestrian at t_detect+3.0 s, 8 m ahead of the ego, at the right edge of the lane (lateral jitter ±0.2 m). It launches even if the vehicle is stationary, and there is no no-encounter exclusion — blocking the selection bias in which an arm's behavior changes whether an encounter occurs. Second, fault-waveform seed fixing (FAULT_SEED). Third, CARLA physics-tick-synchronized recording: ego and pedestrian coordinates, speeds, and separation at every physics frame are recorded to a per-case CSV.</w:t>
-      </w:r>
+        <w:t xml:space="preserve">   The v5 injector for the ablation study adds three things. First, a behavior-independent time trigger: a shadow detector subscribing to the monitoring module's scores takes as t_detect the moment the same threshold as the supervisor is crossed, and in all arms launches a pedestrian at t_detect+3.0 s, 8 m ahead of the ego, at the right edge of the lane (lateral jitter ±0.2 m). It launches even if the vehicle is stationary, and there is no no-encounter exclusion — blocking the selection bias in which an arm's behavior changes whether an encounter occurs. Second, fault-waveform seed fixing (FAULT_SEED). Third, CARLA physics-tick-synchronized recording: ego and pedestrian coordinates, speeds, and separation at every physics frame are recorded to a per-case CSV (the protocol is shown in Figure 4-3).</w:t>
+      </w:r>
+    </w:p>
+    <w:p>
+      <w:pPr>
+        <w:keepNext/>
+        <w:spacing w:line="240" w:lineRule="auto"/>
+        <w:jc w:val="center"/>
+      </w:pPr>
+      <w:r>
+        <w:drawing>
+          <wp:inline xmlns:a="http://schemas.openxmlformats.org/drawingml/2006/main" xmlns:pic="http://schemas.openxmlformats.org/drawingml/2006/picture">
+            <wp:extent cx="5040000" cy="2506304"/>
+            <wp:docPr id="8" name="Picture 8"/>
+            <wp:cNvGraphicFramePr>
+              <a:graphicFrameLocks noChangeAspect="1"/>
+            </wp:cNvGraphicFramePr>
+            <a:graphic>
+              <a:graphicData uri="http://schemas.openxmlformats.org/drawingml/2006/picture">
+                <pic:pic>
+                  <pic:nvPicPr>
+                    <pic:cNvPr id="0" name="fig11_encounter.png"/>
+                    <pic:cNvPicPr/>
+                  </pic:nvPicPr>
+                  <pic:blipFill>
+                    <a:blip r:embed="rId22"/>
+                    <a:stretch>
+                      <a:fillRect/>
+                    </a:stretch>
+                  </pic:blipFill>
+                  <pic:spPr>
+                    <a:xfrm>
+                      <a:off x="0" y="0"/>
+                      <a:ext cx="5040000" cy="2506304"/>
+                    </a:xfrm>
+                    <a:prstGeom prst="rect"/>
+                  </pic:spPr>
+                </pic:pic>
+              </a:graphicData>
+            </a:graphic>
+          </wp:inline>
+        </w:drawing>
+      </w:r>
+    </w:p>
+    <w:p>
+      <w:pPr>
+        <w:keepLines/>
+        <w:spacing w:line="360" w:lineRule="auto" w:before="0" w:after="0"/>
+      </w:pPr>
+      <w:r>
+        <w:rPr>
+          <w:rFonts w:ascii="Times New Roman" w:hAnsi="Times New Roman" w:eastAsia="HY신명조"/>
+          <w:b w:val="0"/>
+          <w:sz w:val="22"/>
+        </w:rPr>
+        <w:t>Figure 4-3. Pedestrian dart-out injection protocol. Fault injection (seed-fixed waveform) → shadow detection t_detect (common to all arms) → a behavior-independent launch at t_detect + 3 s spawns the pedestrian (crosses 12 m, then stops) at the standardized relative geometry of 8 m ahead, right lane edge + 0.5 m (lateral jitter ± 0.2 m).</w:t>
+      </w:r>
+    </w:p>
+    <w:p>
+      <w:pPr>
+        <w:spacing w:line="501" w:lineRule="exact" w:before="0" w:after="0"/>
+      </w:pPr>
     </w:p>
     <w:p>
       <w:pPr>
@@ -12108,7 +12246,7 @@
         <w:drawing>
           <wp:inline xmlns:a="http://schemas.openxmlformats.org/drawingml/2006/main" xmlns:pic="http://schemas.openxmlformats.org/drawingml/2006/picture">
             <wp:extent cx="4320000" cy="4942641"/>
-            <wp:docPr id="8" name="Picture 8"/>
+            <wp:docPr id="9" name="Picture 9"/>
             <wp:cNvGraphicFramePr>
               <a:graphicFrameLocks noChangeAspect="1"/>
             </wp:cNvGraphicFramePr>
@@ -12120,7 +12258,7 @@
                     <pic:cNvPicPr/>
                   </pic:nvPicPr>
                   <pic:blipFill>
-                    <a:blip r:embed="rId22"/>
+                    <a:blip r:embed="rId23"/>
                     <a:stretch>
                       <a:fillRect/>
                     </a:stretch>
@@ -12169,8 +12307,68 @@
           <w:b w:val="0"/>
           <w:sz w:val="22"/>
         </w:rPr>
-        <w:t xml:space="preserve">   Behind the binary detection rates in the table lies a continuous health-score signal. What actually feeds the supervisor's state transitions (0.7/0.3) is the perception channel — under LiDAR degradation the localization capability remains intact, so the deciding variable of health = min(perception, cap_loc) is perception. This deciding variable separates into distinct bands by fault intensity: fault-free runs stay in the normal band and do not drop below the upper threshold of 0.7 after warm-up (measured minimum 0.71 — consistent with zero false activations in the 45 fault-free cases); mid severity stays in the tolerated (normal) band above the threshold (the intended non-intervention of lso-mid rests on this); and high severity departs into a low band below the threshold immediately after fault injection, triggering intervention. This band separation is the basis of the low/mid/high grading and the three-regime state transition (normal/evacuation/deferral). The dashed obstacle channel is dedicated to the MRM movement gate and is not a state-transition trigger channel; its fluctuations below 0.7 (sector-coverage changes in open terrain and during turns) are not triggering events and therefore do not contradict the zero false activations. Note, however, that the health score for the GNSS family (gn) is produced not from the /monitor/scores topic but by the supervisor-internal residual detectors (loc_meas/loc_jump), so this observation applies to the LiDAR-degradation channels of /monitor/scores.</w:t>
-      </w:r>
+        <w:t xml:space="preserve">   Behind the binary detection rates in the table lies a continuous health-score signal (Figure 5-2). What actually feeds the supervisor's state transitions (0.7/0.3) is the perception channel — under LiDAR degradation the localization capability remains intact, so the deciding variable of health = min(perception, cap_loc) is perception. This deciding variable separates into distinct bands by fault intensity: fault-free runs stay in the normal band and do not drop below the upper threshold of 0.7 after warm-up (measured minimum 0.71 — consistent with zero false activations in the 45 fault-free cases); mid severity stays in the tolerated (normal) band above the threshold (the intended non-intervention of lso-mid rests on this); and high severity departs into a low band below the threshold immediately after fault injection, triggering intervention. This band separation is the basis of the low/mid/high grading and the three-regime state transition (normal/evacuation/deferral). The dashed obstacle channel is dedicated to the MRM movement gate and is not a state-transition trigger channel; its fluctuations below 0.7 (sector-coverage changes in open terrain and during turns) are not triggering events and therefore do not contradict the zero false activations. Note, however, that the health score for the GNSS family (gn) is produced not from the /monitor/scores topic but by the supervisor-internal residual detectors (loc_meas/loc_jump), so this observation applies to the LiDAR-degradation channels of /monitor/scores.</w:t>
+      </w:r>
+    </w:p>
+    <w:p>
+      <w:pPr>
+        <w:keepNext/>
+        <w:spacing w:line="240" w:lineRule="auto"/>
+        <w:jc w:val="center"/>
+      </w:pPr>
+      <w:r>
+        <w:drawing>
+          <wp:inline xmlns:a="http://schemas.openxmlformats.org/drawingml/2006/main" xmlns:pic="http://schemas.openxmlformats.org/drawingml/2006/picture">
+            <wp:extent cx="5220000" cy="2316227"/>
+            <wp:docPr id="10" name="Picture 10"/>
+            <wp:cNvGraphicFramePr>
+              <a:graphicFrameLocks noChangeAspect="1"/>
+            </wp:cNvGraphicFramePr>
+            <a:graphic>
+              <a:graphicData uri="http://schemas.openxmlformats.org/drawingml/2006/picture">
+                <pic:pic>
+                  <pic:nvPicPr>
+                    <pic:cNvPr id="0" name="fig12_health.png"/>
+                    <pic:cNvPicPr/>
+                  </pic:nvPicPr>
+                  <pic:blipFill>
+                    <a:blip r:embed="rId24"/>
+                    <a:stretch>
+                      <a:fillRect/>
+                    </a:stretch>
+                  </pic:blipFill>
+                  <pic:spPr>
+                    <a:xfrm>
+                      <a:off x="0" y="0"/>
+                      <a:ext cx="5220000" cy="2316227"/>
+                    </a:xfrm>
+                    <a:prstGeom prst="rect"/>
+                  </pic:spPr>
+                </pic:pic>
+              </a:graphicData>
+            </a:graphic>
+          </wp:inline>
+        </w:drawing>
+      </w:r>
+    </w:p>
+    <w:p>
+      <w:pPr>
+        <w:keepLines/>
+        <w:spacing w:line="360" w:lineRule="auto" w:before="0" w:after="0"/>
+      </w:pPr>
+      <w:r>
+        <w:rPr>
+          <w:rFonts w:ascii="Times New Roman" w:hAnsi="Times New Roman" w:eastAsia="HY신명조"/>
+          <w:b w:val="0"/>
+          <w:sz w:val="22"/>
+        </w:rPr>
+        <w:t>Figure 5-2. Continuous health traces — band separation of the state-transition input channel (solid: perception) against the dual thresholds (0.7/0.3). Dashed lines show the MRM move-gate obstacle channel; one representative run per condition, with warm-up and end-of-run stale artifacts trimmed.</w:t>
+      </w:r>
+    </w:p>
+    <w:p>
+      <w:pPr>
+        <w:spacing w:line="501" w:lineRule="exact" w:before="0" w:after="0"/>
+      </w:pPr>
     </w:p>
     <w:p>
       <w:pPr>
@@ -12759,7 +12957,7 @@
           <w:b w:val="0"/>
           <w:sz w:val="22"/>
         </w:rPr>
-        <w:t xml:space="preserve">   With the fault-free stock stack driving at 4.2 m/s, the results by pedestrian dart-out spawn distance showed a clear staircase: at 14 m and 11 m, all 4/4 per distance were avoided (of each 4, 2 are post-ledger runs adjudicated by the ledger and physics oracle, and the other 2 are pre-ledger runs adjudicated by the runner and video), while at 8, 6, and 5 m all 4/4 at each distance collided (Table 5-3, Figure 5-2). The avoidance/collision boundary thus lies in the 8–11 m interval. This agrees with the stopping-distance model d = vτ + v²/2a (τ≈1.5 s, a≈3.5 m/s²), which predicts d(4.2)=8.8 m, and establishes two things: (i) the choice of 8 m as the dart-out distance in subsequent experiments is a grounded choice of "just below the boundary where avoidance becomes physically impossible," and (ii) since the speed→boundary physics model is validated in this environment, the effect of the speed cap can be interpreted with the same model.</w:t>
+        <w:t xml:space="preserve">   With the fault-free stock stack driving at 4.2 m/s, the results by pedestrian dart-out spawn distance showed a clear staircase: at 14 m and 11 m, all 4/4 per distance were avoided (of each 4, 2 are post-ledger runs adjudicated by the ledger and physics oracle, and the other 2 are pre-ledger runs adjudicated by the runner and video), while at 8, 6, and 5 m all 4/4 at each distance collided (Table 5-3, Figure 5-3). The avoidance/collision boundary thus lies in the 8–11 m interval. This agrees with the stopping-distance model d = vτ + v²/2a (τ≈1.5 s, a≈3.5 m/s²), which predicts d(4.2)=8.8 m, and establishes two things: (i) the choice of 8 m as the dart-out distance in subsequent experiments is a grounded choice of "just below the boundary where avoidance becomes physically impossible," and (ii) since the speed→boundary physics model is validated in this environment, the effect of the speed cap can be interpreted with the same model.</w:t>
       </w:r>
     </w:p>
     <w:p>
@@ -13210,7 +13408,7 @@
         <w:drawing>
           <wp:inline xmlns:a="http://schemas.openxmlformats.org/drawingml/2006/main" xmlns:pic="http://schemas.openxmlformats.org/drawingml/2006/picture">
             <wp:extent cx="4140000" cy="3272984"/>
-            <wp:docPr id="9" name="Picture 9"/>
+            <wp:docPr id="11" name="Picture 11"/>
             <wp:cNvGraphicFramePr>
               <a:graphicFrameLocks noChangeAspect="1"/>
             </wp:cNvGraphicFramePr>
@@ -13222,7 +13420,7 @@
                     <pic:cNvPicPr/>
                   </pic:nvPicPr>
                   <pic:blipFill>
-                    <a:blip r:embed="rId23"/>
+                    <a:blip r:embed="rId25"/>
                     <a:stretch>
                       <a:fillRect/>
                     </a:stretch>
@@ -13252,7 +13450,7 @@
           <w:b w:val="0"/>
           <w:sz w:val="22"/>
         </w:rPr>
-        <w:t>Figure 5-2. Stopping-distance model d = vτ + v²/2a (τ=1.5 s, a=3.5 m/s²) and the measured avoidance/collision boundaries from the distance ladder (shaded bands). The measured boundary at 4.2 m/s (8–11 m) matches the model prediction of 8.8 m, and the boundary at 3.0 m/s (7–8 m) is conservative relative to the prediction of 5.79 m (planner reaction variance). The dashed line marks the dart-out spawn distance of 8 m used in subsequent experiments.</w:t>
+        <w:t>Figure 5-3. Stopping-distance model d = vτ + v²/2a (τ=1.5 s, a=3.5 m/s²) and the measured avoidance/collision boundaries from the distance ladder (shaded bands). The measured boundary at 4.2 m/s (8–11 m) matches the model prediction of 8.8 m, and the boundary at 3.0 m/s (7–8 m) is conservative relative to the prediction of 5.79 m (planner reaction variance). The dashed line marks the dart-out spawn distance of 8 m used in subsequent experiments.</w:t>
       </w:r>
     </w:p>
     <w:p>
@@ -16837,7 +17035,7 @@
         <w:drawing>
           <wp:inline xmlns:a="http://schemas.openxmlformats.org/drawingml/2006/main" xmlns:pic="http://schemas.openxmlformats.org/drawingml/2006/picture">
             <wp:extent cx="3960000" cy="3080000"/>
-            <wp:docPr id="10" name="Picture 10"/>
+            <wp:docPr id="12" name="Picture 12"/>
             <wp:cNvGraphicFramePr>
               <a:graphicFrameLocks noChangeAspect="1"/>
             </wp:cNvGraphicFramePr>
@@ -16849,7 +17047,7 @@
                     <pic:cNvPicPr/>
                   </pic:nvPicPr>
                   <pic:blipFill>
-                    <a:blip r:embed="rId24"/>
+                    <a:blip r:embed="rId26"/>
                     <a:stretch>
                       <a:fillRect/>
                     </a:stretch>
@@ -16879,7 +17077,7 @@
           <w:b w:val="0"/>
           <w:sz w:val="22"/>
         </w:rPr>
-        <w:t>Figure 5-3. Kaplan–Meier curve of lane clearance for no-collision evacuation cases (first-round ablation sample, conditional n=13). With 6 observed departures (median 11.0 s) and 7 right-censored cases (|), the final survival is 0.538, so the median exceeds the observation horizon (20 s). Computed identically to the time-distribution rules of Table 5-6.</w:t>
+        <w:t>Figure 5-4. Kaplan–Meier curve of lane clearance for no-collision evacuation cases (first-round ablation sample, conditional n=13). With 6 observed departures (median 11.0 s) and 7 right-censored cases (|), the final survival is 0.538, so the median exceeds the observation horizon (20 s). Computed identically to the time-distribution rules of Table 5-6.</w:t>
       </w:r>
     </w:p>
     <w:p>
@@ -16921,8 +17119,68 @@
           <w:b w:val="0"/>
           <w:sz w:val="22"/>
         </w:rPr>
-        <w:t xml:space="preserve">   Splitting the encounter outcomes of the same capped evacuation policy (A4-type) by time regime yields a sharp contrast: launches in the detection+3 s transient (deceleration incomplete) collided in 11/20, whereas launches in settled cruise with deceleration complete (3.0 m/s restart cruise, 8 m encounter re-experiment) had 0/8 collisions.</w:t>
-      </w:r>
+        <w:t xml:space="preserve">   Splitting the encounter outcomes of the same capped evacuation policy (A4-type) by time regime yields a sharp contrast (Figure 5-5): launches in the detection+3 s transient (deceleration incomplete) collided in 11/20, whereas launches in settled cruise with deceleration complete (3.0 m/s restart cruise, 8 m encounter re-experiment) had 0/8 collisions.</w:t>
+      </w:r>
+    </w:p>
+    <w:p>
+      <w:pPr>
+        <w:keepNext/>
+        <w:spacing w:line="240" w:lineRule="auto"/>
+        <w:jc w:val="center"/>
+      </w:pPr>
+      <w:r>
+        <w:drawing>
+          <wp:inline xmlns:a="http://schemas.openxmlformats.org/drawingml/2006/main" xmlns:pic="http://schemas.openxmlformats.org/drawingml/2006/picture">
+            <wp:extent cx="5220000" cy="2088508"/>
+            <wp:docPr id="13" name="Picture 13"/>
+            <wp:cNvGraphicFramePr>
+              <a:graphicFrameLocks noChangeAspect="1"/>
+            </wp:cNvGraphicFramePr>
+            <a:graphic>
+              <a:graphicData uri="http://schemas.openxmlformats.org/drawingml/2006/picture">
+                <pic:pic>
+                  <pic:nvPicPr>
+                    <pic:cNvPr id="0" name="fig10_ablation.png"/>
+                    <pic:cNvPicPr/>
+                  </pic:nvPicPr>
+                  <pic:blipFill>
+                    <a:blip r:embed="rId27"/>
+                    <a:stretch>
+                      <a:fillRect/>
+                    </a:stretch>
+                  </pic:blipFill>
+                  <pic:spPr>
+                    <a:xfrm>
+                      <a:off x="0" y="0"/>
+                      <a:ext cx="5220000" cy="2088508"/>
+                    </a:xfrm>
+                    <a:prstGeom prst="rect"/>
+                  </pic:spPr>
+                </pic:pic>
+              </a:graphicData>
+            </a:graphic>
+          </wp:inline>
+        </w:drawing>
+      </w:r>
+    </w:p>
+    <w:p>
+      <w:pPr>
+        <w:keepLines/>
+        <w:spacing w:line="360" w:lineRule="auto" w:before="0" w:after="0"/>
+      </w:pPr>
+      <w:r>
+        <w:rPr>
+          <w:rFonts w:ascii="Times New Roman" w:hAnsi="Times New Roman" w:eastAsia="HY신명조"/>
+          <w:b w:val="0"/>
+          <w:sz w:val="22"/>
+        </w:rPr>
+        <w:t>Figure 5-5. Ablation results (ledger verdicts, pooled n = 20). (a) Collision/avoidance decomposition of the four arms — launched in the detection + 3 s transient. (b) The same capped (3.0 m/s) evacuation policy in two regimes — 11/20 in the transient versus 0/8 in settled cruise.</w:t>
+      </w:r>
+    </w:p>
+    <w:p>
+      <w:pPr>
+        <w:spacing w:line="501" w:lineRule="exact" w:before="0" w:after="0"/>
+      </w:pPr>
     </w:p>
     <w:p>
       <w:pPr>

</xml_diff>

<commit_message>
그림 5-2 v2: two-panel health traces (lso + newly collected cn traces), nav-family exclusion rationale in caption+body (gn·imn = supervisor-internal residuals); trace collection scripts kept (results CSVs gitignored)
Co-Authored-By: Claude Fable 5 <noreply@anthropic.com>
Claude-Session: https://claude.ai/code/session_01NtLkxt91PCkwwW6kGTEs5W
</commit_message>
<xml_diff>
--- a/doc/thesis_en_v20_0826.docx
+++ b/doc/thesis_en_v20_0826.docx
@@ -2753,7 +2753,7 @@
           <w:b w:val="0"/>
           <w:sz w:val="22"/>
         </w:rPr>
-        <w:t>Figure 5-2. Continuous health traces — band separation of the state-transition input channel (solid: perception) against the dual thresholds (0.7/0.3)</w:t>
+        <w:t>Figure 5-2. Continuous health traces — band separation of the state-transition input (perception capability) score: (a) LiDAR soiling (lso), (b) camera pixel noise (cn), with the dual thresholds 0.7/0.3</w:t>
       </w:r>
       <w:r>
         <w:rPr>
@@ -12307,7 +12307,7 @@
           <w:b w:val="0"/>
           <w:sz w:val="22"/>
         </w:rPr>
-        <w:t xml:space="preserve">   Behind the binary detection rates in the table lies a continuous health-score signal (Figure 5-2). What actually feeds the supervisor's state transitions (0.7/0.3) is the perception channel — under LiDAR degradation the localization capability remains intact, so the deciding variable of health = min(perception, cap_loc) is perception. This deciding variable separates into distinct bands by fault intensity: fault-free runs stay in the normal band and do not drop below the upper threshold of 0.7 after warm-up (measured minimum 0.71 — consistent with zero false activations in the 45 fault-free cases); mid severity stays in the tolerated (normal) band above the threshold (the intended non-intervention of lso-mid rests on this); and high severity departs into a low band below the threshold immediately after fault injection, triggering intervention. This band separation is the basis of the low/mid/high grading and the three-regime state transition (normal/evacuation/deferral). The dashed obstacle channel is dedicated to the MRM movement gate and is not a state-transition trigger channel; its fluctuations below 0.7 (sector-coverage changes in open terrain and during turns) are not triggering events and therefore do not contradict the zero false activations. Note, however, that the health score for the GNSS family (gn) is produced not from the /monitor/scores topic but by the supervisor-internal residual detectors (loc_meas/loc_jump), so this observation applies to the LiDAR-degradation channels of /monitor/scores.</w:t>
+        <w:t xml:space="preserve">   Behind the binary detection rates in the table lies a continuous health-score signal (Figure 5-2). What actually feeds the supervisor's state transitions (0.7/0.3) is the perception channel — under LiDAR degradation the localization capability remains intact, so the deciding variable of health = min(perception, cap_loc) is perception. This deciding variable separates into distinct bands by fault intensity: fault-free runs stay in the normal band and do not drop below the upper threshold of 0.7 after warm-up (measured minimum 0.71 — consistent with zero false activations in the 45 fault-free cases); mid severity stays in the tolerated (normal) band above the threshold (the intended non-intervention of lso-mid rests on this); and high severity departs into a low band below the threshold immediately after fault injection, triggering intervention. This band separation is the basis of the low/mid/high grading and the three-regime state transition (normal/evacuation/deferral). The obstacle channel is dedicated to the MRM movement gate and is not a state-transition trigger channel; its fluctuations below 0.7 (sector-coverage changes in open terrain and during turns) are not triggering events and therefore do not contradict the zero false activations. Note, however, that the health score for the navigation family (gn, imn) is produced not from the /monitor/scores topic but by the supervisor-internal residual detectors (loc_meas/loc_jump), so this observation applies to the LiDAR-degradation channels of /monitor/scores.</w:t>
       </w:r>
     </w:p>
     <w:p>
@@ -12319,7 +12319,7 @@
       <w:r>
         <w:drawing>
           <wp:inline xmlns:a="http://schemas.openxmlformats.org/drawingml/2006/main" xmlns:pic="http://schemas.openxmlformats.org/drawingml/2006/picture">
-            <wp:extent cx="5220000" cy="2316227"/>
+            <wp:extent cx="5220000" cy="2011345"/>
             <wp:docPr id="10" name="Picture 10"/>
             <wp:cNvGraphicFramePr>
               <a:graphicFrameLocks noChangeAspect="1"/>
@@ -12340,7 +12340,7 @@
                   <pic:spPr>
                     <a:xfrm>
                       <a:off x="0" y="0"/>
-                      <a:ext cx="5220000" cy="2316227"/>
+                      <a:ext cx="5220000" cy="2011345"/>
                     </a:xfrm>
                     <a:prstGeom prst="rect"/>
                   </pic:spPr>
@@ -12362,7 +12362,7 @@
           <w:b w:val="0"/>
           <w:sz w:val="22"/>
         </w:rPr>
-        <w:t>Figure 5-2. Continuous health traces — band separation of the state-transition input channel (solid: perception) against the dual thresholds (0.7/0.3). Dashed lines show the MRM move-gate obstacle channel; one representative run per condition, with warm-up and end-of-run stale artifacts trimmed.</w:t>
+        <w:t>Figure 5-2. Continuous health traces — band separation of the state-transition input (perception capability) score: (a) LiDAR soiling (lso), (b) camera pixel noise (cn), with the dual thresholds 0.7/0.3. One representative run per condition; warm-up and end-of-run stale artifacts are trimmed. The navigation family (gn, imn) is out of scope here by design — its decision variables come from residual detectors inside the supervisor, not from /monitor/scores.</w:t>
       </w:r>
     </w:p>
     <w:p>

</xml_diff>

<commit_message>
그림 5-2: trim post-engagement warm-up transient (+18s cut, display from 3s) per review
Co-Authored-By: Claude Fable 5 <noreply@anthropic.com>
Claude-Session: https://claude.ai/code/session_01NtLkxt91PCkwwW6kGTEs5W
</commit_message>
<xml_diff>
--- a/doc/thesis_en_v20_0826.docx
+++ b/doc/thesis_en_v20_0826.docx
@@ -12319,7 +12319,7 @@
       <w:r>
         <w:drawing>
           <wp:inline xmlns:a="http://schemas.openxmlformats.org/drawingml/2006/main" xmlns:pic="http://schemas.openxmlformats.org/drawingml/2006/picture">
-            <wp:extent cx="5220000" cy="2011345"/>
+            <wp:extent cx="5220000" cy="2010038"/>
             <wp:docPr id="10" name="Picture 10"/>
             <wp:cNvGraphicFramePr>
               <a:graphicFrameLocks noChangeAspect="1"/>
@@ -12340,7 +12340,7 @@
                   <pic:spPr>
                     <a:xfrm>
                       <a:off x="0" y="0"/>
-                      <a:ext cx="5220000" cy="2011345"/>
+                      <a:ext cx="5220000" cy="2010038"/>
                     </a:xfrm>
                     <a:prstGeom prst="rect"/>
                   </pic:spPr>

</xml_diff>

<commit_message>
그림 5-2: true engagement-time axis (no re-zeroing; display window from 21 s), onset lines at true times
Co-Authored-By: Claude Fable 5 <noreply@anthropic.com>
Claude-Session: https://claude.ai/code/session_01NtLkxt91PCkwwW6kGTEs5W
</commit_message>
<xml_diff>
--- a/doc/thesis_en_v20_0826.docx
+++ b/doc/thesis_en_v20_0826.docx
@@ -12319,7 +12319,7 @@
       <w:r>
         <w:drawing>
           <wp:inline xmlns:a="http://schemas.openxmlformats.org/drawingml/2006/main" xmlns:pic="http://schemas.openxmlformats.org/drawingml/2006/picture">
-            <wp:extent cx="5220000" cy="2010038"/>
+            <wp:extent cx="5220000" cy="2011345"/>
             <wp:docPr id="10" name="Picture 10"/>
             <wp:cNvGraphicFramePr>
               <a:graphicFrameLocks noChangeAspect="1"/>
@@ -12340,7 +12340,7 @@
                   <pic:spPr>
                     <a:xfrm>
                       <a:off x="0" y="0"/>
-                      <a:ext cx="5220000" cy="2010038"/>
+                      <a:ext cx="5220000" cy="2011345"/>
                     </a:xfrm>
                     <a:prstGeom prst="rect"/>
                   </pic:spPr>

</xml_diff>

<commit_message>
그림 5-2 v3: 2x2 split — top decision-variable capability, bottom affected-sensor raw score per fault family; captions rewritten (KO/EN); reveals lso-mid level depression vs nf
Co-Authored-By: Claude Fable 5 <noreply@anthropic.com>
Claude-Session: https://claude.ai/code/session_01NtLkxt91PCkwwW6kGTEs5W
</commit_message>
<xml_diff>
--- a/doc/thesis_en_v20_0826.docx
+++ b/doc/thesis_en_v20_0826.docx
@@ -2753,7 +2753,7 @@
           <w:b w:val="0"/>
           <w:sz w:val="22"/>
         </w:rPr>
-        <w:t>Figure 5-2. Continuous health traces — band separation of the state-transition input (perception capability) score: (a) LiDAR soiling (lso), (b) camera pixel noise (cn), with the dual thresholds 0.7/0.3</w:t>
+        <w:t>Figure 5-2. Continuous health traces — (top) the perception capability score that feeds the state transitions (dual thresholds 0.7/0.3) and (bottom) the affected sensor's raw score: (a) LiDAR soiling (lso), (b) camera pixel noise (cn)</w:t>
       </w:r>
       <w:r>
         <w:rPr>
@@ -12319,7 +12319,7 @@
       <w:r>
         <w:drawing>
           <wp:inline xmlns:a="http://schemas.openxmlformats.org/drawingml/2006/main" xmlns:pic="http://schemas.openxmlformats.org/drawingml/2006/picture">
-            <wp:extent cx="5220000" cy="2011345"/>
+            <wp:extent cx="5220000" cy="3134717"/>
             <wp:docPr id="10" name="Picture 10"/>
             <wp:cNvGraphicFramePr>
               <a:graphicFrameLocks noChangeAspect="1"/>
@@ -12340,7 +12340,7 @@
                   <pic:spPr>
                     <a:xfrm>
                       <a:off x="0" y="0"/>
-                      <a:ext cx="5220000" cy="2011345"/>
+                      <a:ext cx="5220000" cy="3134717"/>
                     </a:xfrm>
                     <a:prstGeom prst="rect"/>
                   </pic:spPr>
@@ -12362,7 +12362,7 @@
           <w:b w:val="0"/>
           <w:sz w:val="22"/>
         </w:rPr>
-        <w:t>Figure 5-2. Continuous health traces — band separation of the state-transition input (perception capability) score: (a) LiDAR soiling (lso), (b) camera pixel noise (cn), with the dual thresholds 0.7/0.3. One representative run per condition; warm-up and end-of-run stale artifacts are trimmed. The navigation family (gn, imn) is out of scope here by design — its decision variables come from residual detectors inside the supervisor, not from /monitor/scores. Vertical dotted lines mark fault onset, detected as the step drop of the affected sensor's raw score (not shown for lso-mid, whose step is buried in quality-metric variation — consistent with its tolerated grade). In (b), the faint dotted lines are the raw camera score, flat until onset — the pre-onset capability steps are scene-dependent LiDAR-quality variation (of the same character as the fault-free curve), not a fault effect.</w:t>
+        <w:t>Figure 5-2. Continuous health traces — (top) the perception capability score that feeds the state transitions (dual thresholds 0.7/0.3) and (bottom) the affected sensor's raw score: (a) LiDAR soiling (lso), (b) camera pixel noise (cn). One representative run per condition; the warm-up interval lies outside the display window. Vertical dotted lines mark fault onset, detected as a step drop of the raw score (not marked for lso-mid, which shows a level depression without a step — consistent with its tolerated grade). Pre-onset fluctuation of the capability score is scene-dependent variation of the same character as the fault-free curve; the raw-score row separates it from the fault effect. The navigation family (gn, imn) is out of scope by design — its decision variables come from residual detectors inside the supervisor, not /monitor/scores.</w:t>
       </w:r>
     </w:p>
     <w:p>

</xml_diff>

<commit_message>
그림 5-2 v4: injection-aligned axis (ledger FAULT_ACTIVE sim time; fresh clean re-collection of lso mid/high + cn high), nf as P5-P95 band; captions rewritten KO/EN
Co-Authored-By: Claude Fable 5 <noreply@anthropic.com>
Claude-Session: https://claude.ai/code/session_01NtLkxt91PCkwwW6kGTEs5W
</commit_message>
<xml_diff>
--- a/doc/thesis_en_v20_0826.docx
+++ b/doc/thesis_en_v20_0826.docx
@@ -2753,7 +2753,7 @@
           <w:b w:val="0"/>
           <w:sz w:val="22"/>
         </w:rPr>
-        <w:t>Figure 5-2. Continuous health traces — (top) the perception capability score that feeds the state transitions (dual thresholds 0.7/0.3) and (bottom) the affected sensor's raw score: (a) LiDAR soiling (lso), (b) camera pixel noise (cn)</w:t>
+        <w:t>Figure 5-2. Injection-aligned continuous health traces — (top) the perception capability score that feeds the state transitions (dual thresholds 0.7/0.3) and (bottom) the affected sensor's raw score: (a) LiDAR soiling (lso), (b) camera pixel noise (cn)</w:t>
       </w:r>
       <w:r>
         <w:rPr>
@@ -12319,7 +12319,7 @@
       <w:r>
         <w:drawing>
           <wp:inline xmlns:a="http://schemas.openxmlformats.org/drawingml/2006/main" xmlns:pic="http://schemas.openxmlformats.org/drawingml/2006/picture">
-            <wp:extent cx="5220000" cy="3134717"/>
+            <wp:extent cx="5220000" cy="3132678"/>
             <wp:docPr id="10" name="Picture 10"/>
             <wp:cNvGraphicFramePr>
               <a:graphicFrameLocks noChangeAspect="1"/>
@@ -12340,7 +12340,7 @@
                   <pic:spPr>
                     <a:xfrm>
                       <a:off x="0" y="0"/>
-                      <a:ext cx="5220000" cy="3134717"/>
+                      <a:ext cx="5220000" cy="3132678"/>
                     </a:xfrm>
                     <a:prstGeom prst="rect"/>
                   </pic:spPr>
@@ -12362,7 +12362,7 @@
           <w:b w:val="0"/>
           <w:sz w:val="22"/>
         </w:rPr>
-        <w:t>Figure 5-2. Continuous health traces — (top) the perception capability score that feeds the state transitions (dual thresholds 0.7/0.3) and (bottom) the affected sensor's raw score: (a) LiDAR soiling (lso), (b) camera pixel noise (cn). One representative run per condition; the warm-up interval lies outside the display window. Vertical dotted lines mark fault onset, detected as a step drop of the raw score (not marked for lso-mid, which shows a level depression without a step — consistent with its tolerated grade). Pre-onset fluctuation of the capability score is scene-dependent variation of the same character as the fault-free curve; the raw-score row separates it from the fault effect. The navigation family (gn, imn) is out of scope by design — its decision variables come from residual detectors inside the supervisor, not /monitor/scores.</w:t>
+        <w:t>Figure 5-2. Injection-aligned continuous health traces — (top) the perception capability score that feeds the state transitions (dual thresholds 0.7/0.3) and (bottom) the affected sensor's raw score: (a) LiDAR soiling (lso), (b) camera pixel noise (cn). Time zero is the fault-injection instant (simulation time of the ledger's FAULT_ACTIVE event); the injection schedule is identical across runs. The shaded band is the P5–P95 range of the fault-free run's settled interval (fault-free runs have no injection anchor, so a range replaces a time-aligned curve). One representative run per condition. lso-mid is tolerated — despite the level drop of the raw score, capability never crosses the upper threshold, and the run continues to route completion — whereas lso-high and both cn severities cross the threshold and trigger intervention. The navigation family (gn, imn) is out of scope by design — its decision variables come from residual detectors inside the supervisor, not /monitor/scores.</w:t>
       </w:r>
     </w:p>
     <w:p>

</xml_diff>

<commit_message>
그림 4-2: 5-row fault-effects figure per user pick (nav 2x3 gn/gb/gf + imn/imb/imd, gf step style), caption (d) family enumeration, width 8.5cm — image+caption on one page
Co-Authored-By: Claude Fable 5 <noreply@anthropic.com>
Claude-Session: https://claude.ai/code/session_01NtLkxt91PCkwwW6kGTEs5W
</commit_message>
<xml_diff>
--- a/doc/thesis_en_v20_0826.docx
+++ b/doc/thesis_en_v20_0826.docx
@@ -8255,7 +8255,7 @@
       <w:r>
         <w:drawing>
           <wp:inline xmlns:a="http://schemas.openxmlformats.org/drawingml/2006/main" xmlns:pic="http://schemas.openxmlformats.org/drawingml/2006/picture">
-            <wp:extent cx="4140000" cy="5589988"/>
+            <wp:extent cx="3060000" cy="4763359"/>
             <wp:docPr id="7" name="Picture 7"/>
             <wp:cNvGraphicFramePr>
               <a:graphicFrameLocks noChangeAspect="1"/>
@@ -8276,7 +8276,7 @@
                   <pic:spPr>
                     <a:xfrm>
                       <a:off x="0" y="0"/>
-                      <a:ext cx="4140000" cy="5589988"/>
+                      <a:ext cx="3060000" cy="4763359"/>
                     </a:xfrm>
                     <a:prstGeom prst="rect"/>
                   </pic:spPr>
@@ -8298,7 +8298,7 @@
           <w:b w:val="0"/>
           <w:sz w:val="22"/>
         </w:rPr>
-        <w:t>Figure 4-2. Sensor-level effects of fault injection — before/after applying the same physical equations and parameters as the injector to one measured Town07 LiDAR scan and camera frame. (a) LiDAR sparsification (lso): intensity attenuation (T²) in the front contaminated sector and disappearance below the detection threshold — distant, dark targets vanish first. (b) LiDAR clutter (lcl): long-range dropout from precipitation attenuation, range jitter, and near-range-biased spurious returns (red). (c) Camera pixel noise (cn). (d) Navigation fault waveforms — the temporal structure of white noise (gn), correlated bias (gb), and bias ramp (imd). Parameters in all panels are the raw mid/high values of Table 4-2.</w:t>
+        <w:t>Figure 4-2. Sensor-level effects of fault injection — before/after applying the same physical equations and parameters as the injector to one measured Town07 LiDAR scan and camera frame. (a) LiDAR sparsification (lso): intensity attenuation (T²) in the front contaminated sector and disappearance below the detection threshold — distant, dark targets vanish first. (b) LiDAR clutter (lcl): long-range dropout from precipitation attenuation, range jitter, and near-range-biased spurious returns (red). (c) Camera pixel noise (cn). (d) temporal structure of the navigation fault waveforms — GNSS family (white noise gn, correlated bias gb, outage gf) and gyro family (white noise imn, fixed bias imb, bias ramp imd). Parameters in all panels are the raw mid/high values of Table 4-2.</w:t>
       </w:r>
     </w:p>
     <w:p>

</xml_diff>